<commit_message>
lots of changes for reviewer comments
</commit_message>
<xml_diff>
--- a/Docs/00_CanJFS/R1_18062026/R1_CanJFS_Figure_3.docx
+++ b/Docs/00_CanJFS/R1_18062026/R1_CanJFS_Figure_3.docx
@@ -24,383 +24,11 @@
           <w:sz w:val="22"/>
           <w:szCs w:val="22"/>
         </w:rPr>
-        <mc:AlternateContent>
-          <mc:Choice Requires="wps">
-            <w:drawing>
-              <wp:anchor distT="0" distB="0" distL="114300" distR="114300" simplePos="0" relativeHeight="251662336" behindDoc="0" locked="0" layoutInCell="1" allowOverlap="1" wp14:anchorId="0F2ED082" wp14:editId="7E3D3483">
-                <wp:simplePos x="0" y="0"/>
-                <wp:positionH relativeFrom="column">
-                  <wp:posOffset>4662311</wp:posOffset>
-                </wp:positionH>
-                <wp:positionV relativeFrom="paragraph">
-                  <wp:posOffset>11289</wp:posOffset>
-                </wp:positionV>
-                <wp:extent cx="790222" cy="311185"/>
-                <wp:effectExtent l="0" t="0" r="0" b="0"/>
-                <wp:wrapNone/>
-                <wp:docPr id="1663905613" name="Text Box 9"/>
-                <wp:cNvGraphicFramePr/>
-                <a:graphic xmlns:a="http://schemas.openxmlformats.org/drawingml/2006/main">
-                  <a:graphicData uri="http://schemas.microsoft.com/office/word/2010/wordprocessingShape">
-                    <wps:wsp>
-                      <wps:cNvSpPr txBox="1"/>
-                      <wps:spPr>
-                        <a:xfrm>
-                          <a:off x="0" y="0"/>
-                          <a:ext cx="790222" cy="311185"/>
-                        </a:xfrm>
-                        <a:prstGeom prst="rect">
-                          <a:avLst/>
-                        </a:prstGeom>
-                        <a:noFill/>
-                        <a:ln w="6350">
-                          <a:noFill/>
-                        </a:ln>
-                      </wps:spPr>
-                      <wps:txbx>
-                        <w:txbxContent>
-                          <w:p>
-                            <w:pPr>
-                              <w:pStyle w:val="ListParagraph"/>
-                            </w:pPr>
-                            <w:r>
-                              <w:t>D.</w:t>
-                            </w:r>
-                          </w:p>
-                        </w:txbxContent>
-                      </wps:txbx>
-                      <wps:bodyPr rot="0" spcFirstLastPara="0" vertOverflow="overflow" horzOverflow="overflow" vert="horz" wrap="square" lIns="91440" tIns="45720" rIns="91440" bIns="45720" numCol="1" spcCol="0" rtlCol="0" fromWordArt="0" anchor="t" anchorCtr="0" forceAA="0" compatLnSpc="1">
-                        <a:prstTxWarp prst="textNoShape">
-                          <a:avLst/>
-                        </a:prstTxWarp>
-                        <a:noAutofit/>
-                      </wps:bodyPr>
-                    </wps:wsp>
-                  </a:graphicData>
-                </a:graphic>
-                <wp14:sizeRelH relativeFrom="margin">
-                  <wp14:pctWidth>0</wp14:pctWidth>
-                </wp14:sizeRelH>
-                <wp14:sizeRelV relativeFrom="margin">
-                  <wp14:pctHeight>0</wp14:pctHeight>
-                </wp14:sizeRelV>
-              </wp:anchor>
-            </w:drawing>
-          </mc:Choice>
-          <mc:Fallback>
-            <w:pict>
-              <v:shapetype w14:anchorId="0F2ED082" id="_x0000_t202" coordsize="21600,21600" o:spt="202" path="m,l,21600r21600,l21600,xe">
-                <v:stroke joinstyle="miter"/>
-                <v:path gradientshapeok="t" o:connecttype="rect"/>
-              </v:shapetype>
-              <v:shape id="Text Box 9" o:spid="_x0000_s1026" type="#_x0000_t202" style="position:absolute;margin-left:367.1pt;margin-top:.9pt;width:62.2pt;height:24.5pt;z-index:251662336;visibility:visible;mso-wrap-style:square;mso-width-percent:0;mso-height-percent:0;mso-wrap-distance-left:9pt;mso-wrap-distance-top:0;mso-wrap-distance-right:9pt;mso-wrap-distance-bottom:0;mso-position-horizontal:absolute;mso-position-horizontal-relative:text;mso-position-vertical:absolute;mso-position-vertical-relative:text;mso-width-percent:0;mso-height-percent:0;mso-width-relative:margin;mso-height-relative:margin;v-text-anchor:top" o:gfxdata="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" filled="f" stroked="f" strokeweight=".5pt">
-                <v:textbox>
-                  <w:txbxContent>
-                    <w:p>
-                      <w:pPr>
-                        <w:pStyle w:val="ListParagraph"/>
-                      </w:pPr>
-                      <w:r>
-                        <w:t>D.</w:t>
-                      </w:r>
-                    </w:p>
-                  </w:txbxContent>
-                </v:textbox>
-              </v:shape>
-            </w:pict>
-          </mc:Fallback>
-        </mc:AlternateContent>
-      </w:r>
-      <w:r>
-        <w:rPr>
-          <w:rFonts w:ascii="Garamond" w:hAnsi="Garamond"/>
-          <w:b/>
-          <w:bCs/>
-          <w:noProof/>
-          <w:sz w:val="22"/>
-          <w:szCs w:val="22"/>
-        </w:rPr>
-        <mc:AlternateContent>
-          <mc:Choice Requires="wps">
-            <w:drawing>
-              <wp:anchor distT="0" distB="0" distL="114300" distR="114300" simplePos="0" relativeHeight="251660288" behindDoc="0" locked="0" layoutInCell="1" allowOverlap="1" wp14:anchorId="661AE6CA" wp14:editId="08EFA877">
-                <wp:simplePos x="0" y="0"/>
-                <wp:positionH relativeFrom="column">
-                  <wp:posOffset>2411095</wp:posOffset>
-                </wp:positionH>
-                <wp:positionV relativeFrom="paragraph">
-                  <wp:posOffset>-3175</wp:posOffset>
-                </wp:positionV>
-                <wp:extent cx="622998" cy="311185"/>
-                <wp:effectExtent l="0" t="0" r="0" b="0"/>
-                <wp:wrapNone/>
-                <wp:docPr id="978046690" name="Text Box 9"/>
-                <wp:cNvGraphicFramePr/>
-                <a:graphic xmlns:a="http://schemas.openxmlformats.org/drawingml/2006/main">
-                  <a:graphicData uri="http://schemas.microsoft.com/office/word/2010/wordprocessingShape">
-                    <wps:wsp>
-                      <wps:cNvSpPr txBox="1"/>
-                      <wps:spPr>
-                        <a:xfrm>
-                          <a:off x="0" y="0"/>
-                          <a:ext cx="622998" cy="311185"/>
-                        </a:xfrm>
-                        <a:prstGeom prst="rect">
-                          <a:avLst/>
-                        </a:prstGeom>
-                        <a:noFill/>
-                        <a:ln w="6350">
-                          <a:noFill/>
-                        </a:ln>
-                      </wps:spPr>
-                      <wps:txbx>
-                        <w:txbxContent>
-                          <w:p>
-                            <w:pPr>
-                              <w:ind w:left="360"/>
-                            </w:pPr>
-                            <w:r>
-                              <w:t>B.</w:t>
-                            </w:r>
-                          </w:p>
-                        </w:txbxContent>
-                      </wps:txbx>
-                      <wps:bodyPr rot="0" spcFirstLastPara="0" vertOverflow="overflow" horzOverflow="overflow" vert="horz" wrap="square" lIns="91440" tIns="45720" rIns="91440" bIns="45720" numCol="1" spcCol="0" rtlCol="0" fromWordArt="0" anchor="t" anchorCtr="0" forceAA="0" compatLnSpc="1">
-                        <a:prstTxWarp prst="textNoShape">
-                          <a:avLst/>
-                        </a:prstTxWarp>
-                        <a:noAutofit/>
-                      </wps:bodyPr>
-                    </wps:wsp>
-                  </a:graphicData>
-                </a:graphic>
-                <wp14:sizeRelH relativeFrom="margin">
-                  <wp14:pctWidth>0</wp14:pctWidth>
-                </wp14:sizeRelH>
-                <wp14:sizeRelV relativeFrom="margin">
-                  <wp14:pctHeight>0</wp14:pctHeight>
-                </wp14:sizeRelV>
-              </wp:anchor>
-            </w:drawing>
-          </mc:Choice>
-          <mc:Fallback>
-            <w:pict>
-              <v:shape w14:anchorId="661AE6CA" id="_x0000_s1027" type="#_x0000_t202" style="position:absolute;margin-left:189.85pt;margin-top:-.25pt;width:49.05pt;height:24.5pt;z-index:251660288;visibility:visible;mso-wrap-style:square;mso-width-percent:0;mso-height-percent:0;mso-wrap-distance-left:9pt;mso-wrap-distance-top:0;mso-wrap-distance-right:9pt;mso-wrap-distance-bottom:0;mso-position-horizontal:absolute;mso-position-horizontal-relative:text;mso-position-vertical:absolute;mso-position-vertical-relative:text;mso-width-percent:0;mso-height-percent:0;mso-width-relative:margin;mso-height-relative:margin;v-text-anchor:top" o:gfxdata="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" filled="f" stroked="f" strokeweight=".5pt">
-                <v:textbox>
-                  <w:txbxContent>
-                    <w:p>
-                      <w:pPr>
-                        <w:ind w:left="360"/>
-                      </w:pPr>
-                      <w:r>
-                        <w:t>B.</w:t>
-                      </w:r>
-                    </w:p>
-                  </w:txbxContent>
-                </v:textbox>
-              </v:shape>
-            </w:pict>
-          </mc:Fallback>
-        </mc:AlternateContent>
-      </w:r>
-      <w:r>
-        <w:rPr>
-          <w:rFonts w:ascii="Garamond" w:hAnsi="Garamond"/>
-          <w:b/>
-          <w:bCs/>
-          <w:noProof/>
-          <w:sz w:val="22"/>
-          <w:szCs w:val="22"/>
-        </w:rPr>
-        <mc:AlternateContent>
-          <mc:Choice Requires="wps">
-            <w:drawing>
-              <wp:anchor distT="0" distB="0" distL="114300" distR="114300" simplePos="0" relativeHeight="251661312" behindDoc="0" locked="0" layoutInCell="1" allowOverlap="1" wp14:anchorId="0179F30E" wp14:editId="3E6E15A9">
-                <wp:simplePos x="0" y="0"/>
-                <wp:positionH relativeFrom="column">
-                  <wp:posOffset>3639178</wp:posOffset>
-                </wp:positionH>
-                <wp:positionV relativeFrom="paragraph">
-                  <wp:posOffset>1214</wp:posOffset>
-                </wp:positionV>
-                <wp:extent cx="622998" cy="311185"/>
-                <wp:effectExtent l="0" t="0" r="0" b="0"/>
-                <wp:wrapNone/>
-                <wp:docPr id="1027317102" name="Text Box 9"/>
-                <wp:cNvGraphicFramePr/>
-                <a:graphic xmlns:a="http://schemas.openxmlformats.org/drawingml/2006/main">
-                  <a:graphicData uri="http://schemas.microsoft.com/office/word/2010/wordprocessingShape">
-                    <wps:wsp>
-                      <wps:cNvSpPr txBox="1"/>
-                      <wps:spPr>
-                        <a:xfrm>
-                          <a:off x="0" y="0"/>
-                          <a:ext cx="622998" cy="311185"/>
-                        </a:xfrm>
-                        <a:prstGeom prst="rect">
-                          <a:avLst/>
-                        </a:prstGeom>
-                        <a:noFill/>
-                        <a:ln w="6350">
-                          <a:noFill/>
-                        </a:ln>
-                      </wps:spPr>
-                      <wps:txbx>
-                        <w:txbxContent>
-                          <w:p>
-                            <w:pPr>
-                              <w:ind w:left="360"/>
-                            </w:pPr>
-                            <w:r>
-                              <w:t>C.</w:t>
-                            </w:r>
-                          </w:p>
-                        </w:txbxContent>
-                      </wps:txbx>
-                      <wps:bodyPr rot="0" spcFirstLastPara="0" vertOverflow="overflow" horzOverflow="overflow" vert="horz" wrap="square" lIns="91440" tIns="45720" rIns="91440" bIns="45720" numCol="1" spcCol="0" rtlCol="0" fromWordArt="0" anchor="t" anchorCtr="0" forceAA="0" compatLnSpc="1">
-                        <a:prstTxWarp prst="textNoShape">
-                          <a:avLst/>
-                        </a:prstTxWarp>
-                        <a:noAutofit/>
-                      </wps:bodyPr>
-                    </wps:wsp>
-                  </a:graphicData>
-                </a:graphic>
-                <wp14:sizeRelH relativeFrom="margin">
-                  <wp14:pctWidth>0</wp14:pctWidth>
-                </wp14:sizeRelH>
-                <wp14:sizeRelV relativeFrom="margin">
-                  <wp14:pctHeight>0</wp14:pctHeight>
-                </wp14:sizeRelV>
-              </wp:anchor>
-            </w:drawing>
-          </mc:Choice>
-          <mc:Fallback>
-            <w:pict>
-              <v:shape w14:anchorId="0179F30E" id="_x0000_s1028" type="#_x0000_t202" style="position:absolute;margin-left:286.55pt;margin-top:.1pt;width:49.05pt;height:24.5pt;z-index:251661312;visibility:visible;mso-wrap-style:square;mso-width-percent:0;mso-height-percent:0;mso-wrap-distance-left:9pt;mso-wrap-distance-top:0;mso-wrap-distance-right:9pt;mso-wrap-distance-bottom:0;mso-position-horizontal:absolute;mso-position-horizontal-relative:text;mso-position-vertical:absolute;mso-position-vertical-relative:text;mso-width-percent:0;mso-height-percent:0;mso-width-relative:margin;mso-height-relative:margin;v-text-anchor:top" o:gfxdata="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" filled="f" stroked="f" strokeweight=".5pt">
-                <v:textbox>
-                  <w:txbxContent>
-                    <w:p>
-                      <w:pPr>
-                        <w:ind w:left="360"/>
-                      </w:pPr>
-                      <w:r>
-                        <w:t>C.</w:t>
-                      </w:r>
-                    </w:p>
-                  </w:txbxContent>
-                </v:textbox>
-              </v:shape>
-            </w:pict>
-          </mc:Fallback>
-        </mc:AlternateContent>
-      </w:r>
-      <w:r>
-        <w:rPr>
-          <w:rFonts w:ascii="Garamond" w:hAnsi="Garamond"/>
-          <w:b/>
-          <w:bCs/>
-          <w:noProof/>
-          <w:sz w:val="22"/>
-          <w:szCs w:val="22"/>
-        </w:rPr>
-        <mc:AlternateContent>
-          <mc:Choice Requires="wps">
-            <w:drawing>
-              <wp:anchor distT="0" distB="0" distL="114300" distR="114300" simplePos="0" relativeHeight="251659264" behindDoc="0" locked="0" layoutInCell="1" allowOverlap="1" wp14:anchorId="2041C95E" wp14:editId="16D6D957">
-                <wp:simplePos x="0" y="0"/>
-                <wp:positionH relativeFrom="column">
-                  <wp:posOffset>1125220</wp:posOffset>
-                </wp:positionH>
-                <wp:positionV relativeFrom="paragraph">
-                  <wp:posOffset>-454</wp:posOffset>
-                </wp:positionV>
-                <wp:extent cx="622998" cy="311185"/>
-                <wp:effectExtent l="0" t="0" r="0" b="0"/>
-                <wp:wrapNone/>
-                <wp:docPr id="1130367020" name="Text Box 9"/>
-                <wp:cNvGraphicFramePr/>
-                <a:graphic xmlns:a="http://schemas.openxmlformats.org/drawingml/2006/main">
-                  <a:graphicData uri="http://schemas.microsoft.com/office/word/2010/wordprocessingShape">
-                    <wps:wsp>
-                      <wps:cNvSpPr txBox="1"/>
-                      <wps:spPr>
-                        <a:xfrm>
-                          <a:off x="0" y="0"/>
-                          <a:ext cx="622998" cy="311185"/>
-                        </a:xfrm>
-                        <a:prstGeom prst="rect">
-                          <a:avLst/>
-                        </a:prstGeom>
-                        <a:noFill/>
-                        <a:ln w="6350">
-                          <a:noFill/>
-                        </a:ln>
-                      </wps:spPr>
-                      <wps:txbx>
-                        <w:txbxContent>
-                          <w:p>
-                            <w:pPr>
-                              <w:ind w:left="360"/>
-                            </w:pPr>
-                            <w:r>
-                              <w:t>A.</w:t>
-                            </w:r>
-                          </w:p>
-                        </w:txbxContent>
-                      </wps:txbx>
-                      <wps:bodyPr rot="0" spcFirstLastPara="0" vertOverflow="overflow" horzOverflow="overflow" vert="horz" wrap="square" lIns="91440" tIns="45720" rIns="91440" bIns="45720" numCol="1" spcCol="0" rtlCol="0" fromWordArt="0" anchor="t" anchorCtr="0" forceAA="0" compatLnSpc="1">
-                        <a:prstTxWarp prst="textNoShape">
-                          <a:avLst/>
-                        </a:prstTxWarp>
-                        <a:noAutofit/>
-                      </wps:bodyPr>
-                    </wps:wsp>
-                  </a:graphicData>
-                </a:graphic>
-                <wp14:sizeRelH relativeFrom="margin">
-                  <wp14:pctWidth>0</wp14:pctWidth>
-                </wp14:sizeRelH>
-                <wp14:sizeRelV relativeFrom="margin">
-                  <wp14:pctHeight>0</wp14:pctHeight>
-                </wp14:sizeRelV>
-              </wp:anchor>
-            </w:drawing>
-          </mc:Choice>
-          <mc:Fallback>
-            <w:pict>
-              <v:shape w14:anchorId="2041C95E" id="_x0000_s1029" type="#_x0000_t202" style="position:absolute;margin-left:88.6pt;margin-top:-.05pt;width:49.05pt;height:24.5pt;z-index:251659264;visibility:visible;mso-wrap-style:square;mso-width-percent:0;mso-height-percent:0;mso-wrap-distance-left:9pt;mso-wrap-distance-top:0;mso-wrap-distance-right:9pt;mso-wrap-distance-bottom:0;mso-position-horizontal:absolute;mso-position-horizontal-relative:text;mso-position-vertical:absolute;mso-position-vertical-relative:text;mso-width-percent:0;mso-height-percent:0;mso-width-relative:margin;mso-height-relative:margin;v-text-anchor:top" o:gfxdata="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" filled="f" stroked="f" strokeweight=".5pt">
-                <v:textbox>
-                  <w:txbxContent>
-                    <w:p>
-                      <w:pPr>
-                        <w:ind w:left="360"/>
-                      </w:pPr>
-                      <w:r>
-                        <w:t>A.</w:t>
-                      </w:r>
-                    </w:p>
-                  </w:txbxContent>
-                </v:textbox>
-              </v:shape>
-            </w:pict>
-          </mc:Fallback>
-        </mc:AlternateContent>
-      </w:r>
-      <w:r>
-        <w:rPr>
-          <w:rFonts w:ascii="Garamond" w:hAnsi="Garamond"/>
-          <w:b/>
-          <w:bCs/>
-          <w:noProof/>
-          <w:sz w:val="22"/>
-          <w:szCs w:val="22"/>
-        </w:rPr>
         <w:drawing>
-          <wp:inline distT="0" distB="0" distL="0" distR="0" wp14:anchorId="4B5CAF4E" wp14:editId="3DBE0EDD">
-            <wp:extent cx="5943600" cy="1697990"/>
-            <wp:effectExtent l="0" t="0" r="0" b="3810"/>
-            <wp:docPr id="1062445846" name="Picture 7" descr="A comparison of a diagram&#10;&#10;AI-generated content may be incorrect."/>
+          <wp:inline distT="0" distB="0" distL="0" distR="0" wp14:anchorId="6C1A6D57" wp14:editId="6E80DE44">
+            <wp:extent cx="6543010" cy="2390274"/>
+            <wp:effectExtent l="0" t="0" r="0" b="0"/>
+            <wp:docPr id="802159632" name="Picture 7"/>
             <wp:cNvGraphicFramePr>
               <a:graphicFrameLocks xmlns:a="http://schemas.openxmlformats.org/drawingml/2006/main" noChangeAspect="1"/>
             </wp:cNvGraphicFramePr>
@@ -408,7 +36,7 @@
               <a:graphicData uri="http://schemas.openxmlformats.org/drawingml/2006/picture">
                 <pic:pic xmlns:pic="http://schemas.openxmlformats.org/drawingml/2006/picture">
                   <pic:nvPicPr>
-                    <pic:cNvPr id="1062445846" name="Picture 7" descr="A comparison of a diagram&#10;&#10;AI-generated content may be incorrect."/>
+                    <pic:cNvPr id="1062445846" name="Picture 7"/>
                     <pic:cNvPicPr/>
                   </pic:nvPicPr>
                   <pic:blipFill>
@@ -426,7 +54,7 @@
                   <pic:spPr>
                     <a:xfrm>
                       <a:off x="0" y="0"/>
-                      <a:ext cx="5943600" cy="1697990"/>
+                      <a:ext cx="6568556" cy="2399607"/>
                     </a:xfrm>
                     <a:prstGeom prst="rect">
                       <a:avLst/>
@@ -456,11 +84,19 @@
         </w:rPr>
         <w:t>Figure 3</w:t>
       </w:r>
+      <w:proofErr w:type="gramStart"/>
       <w:r>
         <w:rPr>
           <w:rFonts w:ascii="Garamond" w:hAnsi="Garamond"/>
         </w:rPr>
-        <w:t>:  Median proportion</w:t>
+        <w:t>:  Median</w:t>
+      </w:r>
+      <w:proofErr w:type="gramEnd"/>
+      <w:r>
+        <w:rPr>
+          <w:rFonts w:ascii="Garamond" w:hAnsi="Garamond"/>
+        </w:rPr>
+        <w:t xml:space="preserve"> proportion</w:t>
       </w:r>
       <w:r>
         <w:rPr>

</xml_diff>